<commit_message>
Revisão e correção da documentação dos Casos de Uso 2 a 10.
</commit_message>
<xml_diff>
--- a/Requisitos/Documentos de Casos de Uso/CSU02 - AutenticarUsuario.docx
+++ b/Requisitos/Documentos de Casos de Uso/CSU02 - AutenticarUsuario.docx
@@ -1,6 +1,6 @@
 
 <file path=word/document.xml><?xml version="1.0" encoding="utf-8"?>
-<w:document xmlns:wpc="http://schemas.microsoft.com/office/word/2010/wordprocessingCanvas" xmlns:mc="http://schemas.openxmlformats.org/markup-compatibility/2006" xmlns:o="urn:schemas-microsoft-com:office:office" xmlns:r="http://schemas.openxmlformats.org/officeDocument/2006/relationships" xmlns:m="http://schemas.openxmlformats.org/officeDocument/2006/math" xmlns:v="urn:schemas-microsoft-com:vml" xmlns:wp14="http://schemas.microsoft.com/office/word/2010/wordprocessingDrawing" xmlns:wp="http://schemas.openxmlformats.org/drawingml/2006/wordprocessingDrawing" xmlns:w10="urn:schemas-microsoft-com:office:word" xmlns:w="http://schemas.openxmlformats.org/wordprocessingml/2006/main" xmlns:w14="http://schemas.microsoft.com/office/word/2010/wordml" xmlns:w15="http://schemas.microsoft.com/office/word/2012/wordml" xmlns:wpg="http://schemas.microsoft.com/office/word/2010/wordprocessingGroup" xmlns:wpi="http://schemas.microsoft.com/office/word/2010/wordprocessingInk" xmlns:wne="http://schemas.microsoft.com/office/word/2006/wordml" xmlns:wps="http://schemas.microsoft.com/office/word/2010/wordprocessingShape" mc:Ignorable="w14 w15 wp14">
+<w:document xmlns:wpc="http://schemas.microsoft.com/office/word/2010/wordprocessingCanvas" xmlns:cx="http://schemas.microsoft.com/office/drawing/2014/chartex" xmlns:cx1="http://schemas.microsoft.com/office/drawing/2015/9/8/chartex" xmlns:cx2="http://schemas.microsoft.com/office/drawing/2015/10/21/chartex" xmlns:cx3="http://schemas.microsoft.com/office/drawing/2016/5/9/chartex" xmlns:cx4="http://schemas.microsoft.com/office/drawing/2016/5/10/chartex" xmlns:cx5="http://schemas.microsoft.com/office/drawing/2016/5/11/chartex" xmlns:cx6="http://schemas.microsoft.com/office/drawing/2016/5/12/chartex" xmlns:cx7="http://schemas.microsoft.com/office/drawing/2016/5/13/chartex" xmlns:cx8="http://schemas.microsoft.com/office/drawing/2016/5/14/chartex" xmlns:mc="http://schemas.openxmlformats.org/markup-compatibility/2006" xmlns:aink="http://schemas.microsoft.com/office/drawing/2016/ink" xmlns:am3d="http://schemas.microsoft.com/office/drawing/2017/model3d" xmlns:o="urn:schemas-microsoft-com:office:office" xmlns:oel="http://schemas.microsoft.com/office/2019/extlst" xmlns:r="http://schemas.openxmlformats.org/officeDocument/2006/relationships" xmlns:m="http://schemas.openxmlformats.org/officeDocument/2006/math" xmlns:v="urn:schemas-microsoft-com:vml" xmlns:wp14="http://schemas.microsoft.com/office/word/2010/wordprocessingDrawing" xmlns:wp="http://schemas.openxmlformats.org/drawingml/2006/wordprocessingDrawing" xmlns:w10="urn:schemas-microsoft-com:office:word" xmlns:w="http://schemas.openxmlformats.org/wordprocessingml/2006/main" xmlns:w14="http://schemas.microsoft.com/office/word/2010/wordml" xmlns:w15="http://schemas.microsoft.com/office/word/2012/wordml" xmlns:w16cex="http://schemas.microsoft.com/office/word/2018/wordml/cex" xmlns:w16cid="http://schemas.microsoft.com/office/word/2016/wordml/cid" xmlns:w16="http://schemas.microsoft.com/office/word/2018/wordml" xmlns:w16sdtdh="http://schemas.microsoft.com/office/word/2020/wordml/sdtdatahash" xmlns:w16se="http://schemas.microsoft.com/office/word/2015/wordml/symex" xmlns:wpg="http://schemas.microsoft.com/office/word/2010/wordprocessingGroup" xmlns:wpi="http://schemas.microsoft.com/office/word/2010/wordprocessingInk" xmlns:wne="http://schemas.microsoft.com/office/word/2006/wordml" xmlns:wps="http://schemas.microsoft.com/office/word/2010/wordprocessingShape" mc:Ignorable="w14 w15 w16se w16cid w16 w16cex w16sdtdh wp14">
   <w:body>
     <w:p>
       <w:pPr>
@@ -270,6 +270,12 @@
               </w:rPr>
               <w:t>Solicitante/Entregador/Administrador</w:t>
             </w:r>
+            <w:r>
+              <w:rPr>
+                <w:sz w:val="28"/>
+              </w:rPr>
+              <w:t>.</w:t>
+            </w:r>
           </w:p>
         </w:tc>
       </w:tr>
@@ -456,7 +462,7 @@
       <w:tr>
         <w:trPr>
           <w:cantSplit/>
-          <w:trHeight w:val="3322"/>
+          <w:trHeight w:val="2330"/>
         </w:trPr>
         <w:tc>
           <w:tcPr>
@@ -497,39 +503,96 @@
               </w:numPr>
               <w:jc w:val="left"/>
               <w:rPr>
-                <w:b/>
+                <w:bCs/>
                 <w:sz w:val="32"/>
                 <w:szCs w:val="32"/>
               </w:rPr>
             </w:pPr>
             <w:r>
               <w:rPr>
-                <w:b/>
+                <w:bCs/>
                 <w:sz w:val="32"/>
                 <w:szCs w:val="32"/>
               </w:rPr>
-              <w:t xml:space="preserve">Usuário informa </w:t>
-            </w:r>
-            <w:proofErr w:type="spellStart"/>
-            <w:r>
-              <w:rPr>
-                <w:b/>
+              <w:t>Sistema exibe tela de login e usuário</w:t>
+            </w:r>
+            <w:r>
+              <w:rPr>
+                <w:bCs/>
                 <w:sz w:val="32"/>
                 <w:szCs w:val="32"/>
               </w:rPr>
-              <w:t>email</w:t>
-            </w:r>
-            <w:proofErr w:type="spellEnd"/>
-            <w:r>
-              <w:rPr>
-                <w:b/>
+              <w:t xml:space="preserve"> informa </w:t>
+            </w:r>
+            <w:proofErr w:type="spellStart"/>
+            <w:r>
+              <w:rPr>
+                <w:bCs/>
                 <w:sz w:val="32"/>
                 <w:szCs w:val="32"/>
               </w:rPr>
-              <w:t>/CPF e senha.</w:t>
-            </w:r>
-          </w:p>
-          <w:p/>
+              <w:t>email</w:t>
+            </w:r>
+            <w:proofErr w:type="spellEnd"/>
+            <w:r>
+              <w:rPr>
+                <w:bCs/>
+                <w:sz w:val="32"/>
+                <w:szCs w:val="32"/>
+              </w:rPr>
+              <w:t>/CPF e senha</w:t>
+            </w:r>
+            <w:r>
+              <w:rPr>
+                <w:bCs/>
+                <w:sz w:val="32"/>
+                <w:szCs w:val="32"/>
+              </w:rPr>
+              <w:t xml:space="preserve"> </w:t>
+            </w:r>
+            <w:r>
+              <w:rPr>
+                <w:bCs/>
+                <w:sz w:val="32"/>
+                <w:szCs w:val="32"/>
+              </w:rPr>
+              <w:t>(</w:t>
+            </w:r>
+            <w:r>
+              <w:rPr>
+                <w:bCs/>
+                <w:color w:val="FF0000"/>
+                <w:sz w:val="32"/>
+                <w:szCs w:val="32"/>
+              </w:rPr>
+              <w:t>Tela</w:t>
+            </w:r>
+            <w:r>
+              <w:rPr>
+                <w:bCs/>
+                <w:color w:val="FF0000"/>
+                <w:sz w:val="32"/>
+                <w:szCs w:val="32"/>
+              </w:rPr>
+              <w:t>_01</w:t>
+            </w:r>
+            <w:r>
+              <w:rPr>
+                <w:bCs/>
+                <w:sz w:val="32"/>
+                <w:szCs w:val="32"/>
+              </w:rPr>
+              <w:t>)</w:t>
+            </w:r>
+            <w:r>
+              <w:rPr>
+                <w:bCs/>
+                <w:sz w:val="32"/>
+                <w:szCs w:val="32"/>
+              </w:rPr>
+              <w:t>.</w:t>
+            </w:r>
+          </w:p>
           <w:p>
             <w:pPr>
               <w:pStyle w:val="Ttulo2"/>
@@ -539,14 +602,14 @@
               </w:numPr>
               <w:jc w:val="left"/>
               <w:rPr>
-                <w:b/>
+                <w:bCs/>
                 <w:sz w:val="32"/>
                 <w:szCs w:val="32"/>
               </w:rPr>
             </w:pPr>
             <w:r>
               <w:rPr>
-                <w:b/>
+                <w:bCs/>
                 <w:sz w:val="32"/>
                 <w:szCs w:val="32"/>
               </w:rPr>
@@ -554,23 +617,12 @@
             </w:r>
             <w:r>
               <w:rPr>
-                <w:b/>
+                <w:bCs/>
                 <w:sz w:val="32"/>
                 <w:szCs w:val="32"/>
               </w:rPr>
               <w:t>.</w:t>
             </w:r>
-          </w:p>
-          <w:p>
-            <w:pPr>
-              <w:pStyle w:val="Ttulo2"/>
-              <w:jc w:val="left"/>
-              <w:rPr>
-                <w:b/>
-                <w:sz w:val="32"/>
-                <w:szCs w:val="32"/>
-              </w:rPr>
-            </w:pPr>
           </w:p>
           <w:p>
             <w:pPr>
@@ -581,14 +633,14 @@
               </w:numPr>
               <w:jc w:val="left"/>
               <w:rPr>
-                <w:b/>
+                <w:bCs/>
                 <w:sz w:val="32"/>
                 <w:szCs w:val="32"/>
               </w:rPr>
             </w:pPr>
             <w:r>
               <w:rPr>
-                <w:b/>
+                <w:bCs/>
                 <w:sz w:val="32"/>
                 <w:szCs w:val="32"/>
               </w:rPr>
@@ -596,23 +648,12 @@
             </w:r>
             <w:r>
               <w:rPr>
-                <w:b/>
+                <w:bCs/>
                 <w:sz w:val="32"/>
                 <w:szCs w:val="32"/>
               </w:rPr>
               <w:t>.</w:t>
             </w:r>
-          </w:p>
-          <w:p>
-            <w:pPr>
-              <w:pStyle w:val="Ttulo2"/>
-              <w:jc w:val="left"/>
-              <w:rPr>
-                <w:b/>
-                <w:sz w:val="32"/>
-                <w:szCs w:val="32"/>
-              </w:rPr>
-            </w:pPr>
           </w:p>
           <w:p>
             <w:pPr>
@@ -623,14 +664,14 @@
               </w:numPr>
               <w:jc w:val="left"/>
               <w:rPr>
-                <w:b/>
+                <w:bCs/>
                 <w:sz w:val="32"/>
                 <w:szCs w:val="32"/>
               </w:rPr>
             </w:pPr>
             <w:r>
               <w:rPr>
-                <w:b/>
+                <w:bCs/>
                 <w:sz w:val="32"/>
                 <w:szCs w:val="32"/>
               </w:rPr>
@@ -638,12 +679,55 @@
             </w:r>
             <w:r>
               <w:rPr>
-                <w:b/>
+                <w:bCs/>
                 <w:sz w:val="32"/>
                 <w:szCs w:val="32"/>
               </w:rPr>
+              <w:t>(</w:t>
+            </w:r>
+            <w:r>
+              <w:rPr>
+                <w:bCs/>
+                <w:color w:val="FF0000"/>
+                <w:sz w:val="32"/>
+                <w:szCs w:val="32"/>
+              </w:rPr>
+              <w:t>Tela_0</w:t>
+            </w:r>
+            <w:r>
+              <w:rPr>
+                <w:bCs/>
+                <w:color w:val="FF0000"/>
+                <w:sz w:val="32"/>
+                <w:szCs w:val="32"/>
+              </w:rPr>
+              <w:t>4</w:t>
+            </w:r>
+            <w:r>
+              <w:rPr>
+                <w:bCs/>
+                <w:sz w:val="32"/>
+                <w:szCs w:val="32"/>
+              </w:rPr>
+              <w:t>)</w:t>
+            </w:r>
+            <w:r>
+              <w:rPr>
+                <w:bCs/>
+                <w:sz w:val="32"/>
+                <w:szCs w:val="32"/>
+              </w:rPr>
               <w:t>.</w:t>
             </w:r>
+          </w:p>
+          <w:p/>
+          <w:p/>
+          <w:p>
+            <w:pPr>
+              <w:tabs>
+                <w:tab w:val="left" w:pos="930"/>
+              </w:tabs>
+            </w:pPr>
           </w:p>
         </w:tc>
       </w:tr>
@@ -699,6 +783,7 @@
           <w:p>
             <w:pPr>
               <w:pStyle w:val="Ttulo2"/>
+              <w:jc w:val="left"/>
               <w:rPr>
                 <w:b/>
               </w:rPr>
@@ -716,16 +801,13 @@
               <w:rPr>
                 <w:b/>
               </w:rPr>
-              <w:t>A1</w:t>
-            </w:r>
-            <w:r>
-              <w:t xml:space="preserve"> — Múltiplos p</w:t>
-            </w:r>
-            <w:r>
-              <w:t>erfis (Entregador que também é s</w:t>
-            </w:r>
-            <w:r>
-              <w:t>olicitante) → sistema pergunta com qual perfil entrar antes do passo 4</w:t>
+              <w:t>Linha 3:</w:t>
+            </w:r>
+            <w:r>
+              <w:t xml:space="preserve"> Múltiplos perfis (Entregador que também é solicitante) → sistema pergunta com qual perfil entrar</w:t>
+            </w:r>
+            <w:r>
+              <w:t>.</w:t>
             </w:r>
           </w:p>
         </w:tc>
@@ -792,20 +874,58 @@
             <w:r>
               <w:rPr>
                 <w:b/>
-              </w:rPr>
-              <w:t>E1</w:t>
-            </w:r>
-            <w:r>
-              <w:t xml:space="preserve"> — </w:t>
-            </w:r>
-            <w:r>
-              <w:rPr>
-                <w:sz w:val="28"/>
-              </w:rPr>
-              <w:t>Credenciais inválidas → mensagem de erro, retorna ao passo 1 (limite de tentativas opcional)</w:t>
-            </w:r>
-            <w:bookmarkStart w:id="0" w:name="_GoBack"/>
-            <w:bookmarkEnd w:id="0"/>
+                <w:sz w:val="28"/>
+                <w:szCs w:val="28"/>
+              </w:rPr>
+              <w:t>Linha 2</w:t>
+            </w:r>
+            <w:r>
+              <w:rPr>
+                <w:b/>
+                <w:sz w:val="28"/>
+                <w:szCs w:val="28"/>
+              </w:rPr>
+              <w:t>:</w:t>
+            </w:r>
+            <w:r>
+              <w:t xml:space="preserve"> </w:t>
+            </w:r>
+            <w:r>
+              <w:rPr>
+                <w:sz w:val="28"/>
+              </w:rPr>
+              <w:t xml:space="preserve">Credenciais inválidas → </w:t>
+            </w:r>
+            <w:r>
+              <w:rPr>
+                <w:sz w:val="28"/>
+              </w:rPr>
+              <w:t xml:space="preserve">exibe </w:t>
+            </w:r>
+            <w:r>
+              <w:rPr>
+                <w:sz w:val="28"/>
+              </w:rPr>
+              <w:t>mensagem de erro</w:t>
+            </w:r>
+            <w:r>
+              <w:rPr>
+                <w:sz w:val="28"/>
+              </w:rPr>
+              <w:t xml:space="preserve"> e</w:t>
+            </w:r>
+            <w:r>
+              <w:rPr>
+                <w:sz w:val="28"/>
+              </w:rPr>
+              <w:t xml:space="preserve"> retorna ao passo 1 (limite de tentativas opcional)</w:t>
+            </w:r>
+            <w:r>
+              <w:rPr>
+                <w:sz w:val="28"/>
+              </w:rPr>
+              <w:t>.</w:t>
+            </w:r>
           </w:p>
         </w:tc>
       </w:tr>
@@ -1218,7 +1338,7 @@
 </file>
 
 <file path=word/numbering.xml><?xml version="1.0" encoding="utf-8"?>
-<w:numbering xmlns:wpc="http://schemas.microsoft.com/office/word/2010/wordprocessingCanvas" xmlns:mc="http://schemas.openxmlformats.org/markup-compatibility/2006" xmlns:o="urn:schemas-microsoft-com:office:office" xmlns:r="http://schemas.openxmlformats.org/officeDocument/2006/relationships" xmlns:m="http://schemas.openxmlformats.org/officeDocument/2006/math" xmlns:v="urn:schemas-microsoft-com:vml" xmlns:wp14="http://schemas.microsoft.com/office/word/2010/wordprocessingDrawing" xmlns:wp="http://schemas.openxmlformats.org/drawingml/2006/wordprocessingDrawing" xmlns:w10="urn:schemas-microsoft-com:office:word" xmlns:w="http://schemas.openxmlformats.org/wordprocessingml/2006/main" xmlns:w14="http://schemas.microsoft.com/office/word/2010/wordml" xmlns:w15="http://schemas.microsoft.com/office/word/2012/wordml" xmlns:wpg="http://schemas.microsoft.com/office/word/2010/wordprocessingGroup" xmlns:wpi="http://schemas.microsoft.com/office/word/2010/wordprocessingInk" xmlns:wne="http://schemas.microsoft.com/office/word/2006/wordml" xmlns:wps="http://schemas.microsoft.com/office/word/2010/wordprocessingShape" mc:Ignorable="w14 w15 wp14">
+<w:numbering xmlns:wpc="http://schemas.microsoft.com/office/word/2010/wordprocessingCanvas" xmlns:cx="http://schemas.microsoft.com/office/drawing/2014/chartex" xmlns:cx1="http://schemas.microsoft.com/office/drawing/2015/9/8/chartex" xmlns:cx2="http://schemas.microsoft.com/office/drawing/2015/10/21/chartex" xmlns:cx3="http://schemas.microsoft.com/office/drawing/2016/5/9/chartex" xmlns:cx4="http://schemas.microsoft.com/office/drawing/2016/5/10/chartex" xmlns:cx5="http://schemas.microsoft.com/office/drawing/2016/5/11/chartex" xmlns:cx6="http://schemas.microsoft.com/office/drawing/2016/5/12/chartex" xmlns:cx7="http://schemas.microsoft.com/office/drawing/2016/5/13/chartex" xmlns:cx8="http://schemas.microsoft.com/office/drawing/2016/5/14/chartex" xmlns:mc="http://schemas.openxmlformats.org/markup-compatibility/2006" xmlns:aink="http://schemas.microsoft.com/office/drawing/2016/ink" xmlns:am3d="http://schemas.microsoft.com/office/drawing/2017/model3d" xmlns:o="urn:schemas-microsoft-com:office:office" xmlns:oel="http://schemas.microsoft.com/office/2019/extlst" xmlns:r="http://schemas.openxmlformats.org/officeDocument/2006/relationships" xmlns:m="http://schemas.openxmlformats.org/officeDocument/2006/math" xmlns:v="urn:schemas-microsoft-com:vml" xmlns:wp14="http://schemas.microsoft.com/office/word/2010/wordprocessingDrawing" xmlns:wp="http://schemas.openxmlformats.org/drawingml/2006/wordprocessingDrawing" xmlns:w10="urn:schemas-microsoft-com:office:word" xmlns:w="http://schemas.openxmlformats.org/wordprocessingml/2006/main" xmlns:w14="http://schemas.microsoft.com/office/word/2010/wordml" xmlns:w15="http://schemas.microsoft.com/office/word/2012/wordml" xmlns:w16cex="http://schemas.microsoft.com/office/word/2018/wordml/cex" xmlns:w16cid="http://schemas.microsoft.com/office/word/2016/wordml/cid" xmlns:w16="http://schemas.microsoft.com/office/word/2018/wordml" xmlns:w16sdtdh="http://schemas.microsoft.com/office/word/2020/wordml/sdtdatahash" xmlns:w16se="http://schemas.microsoft.com/office/word/2015/wordml/symex" xmlns:wpg="http://schemas.microsoft.com/office/word/2010/wordprocessingGroup" xmlns:wpi="http://schemas.microsoft.com/office/word/2010/wordprocessingInk" xmlns:wne="http://schemas.microsoft.com/office/word/2006/wordml" xmlns:wps="http://schemas.microsoft.com/office/word/2010/wordprocessingShape" mc:Ignorable="w14 w15 w16se w16cid w16 w16cex w16sdtdh wp14">
   <w:abstractNum w:abstractNumId="0" w15:restartNumberingAfterBreak="0">
     <w:nsid w:val="0145720D"/>
     <w:multiLevelType w:val="singleLevel"/>
@@ -1530,7 +1650,7 @@
       </w:pPr>
     </w:lvl>
   </w:abstractNum>
-  <w:num w:numId="1">
+  <w:num w:numId="1" w16cid:durableId="1569266695">
     <w:abstractNumId w:val="2"/>
     <w:lvlOverride w:ilvl="0">
       <w:startOverride w:val="1"/>
@@ -1560,7 +1680,7 @@
       <w:startOverride w:val="1"/>
     </w:lvlOverride>
   </w:num>
-  <w:num w:numId="2">
+  <w:num w:numId="2" w16cid:durableId="272131543">
     <w:abstractNumId w:val="1"/>
     <w:lvlOverride w:ilvl="0">
       <w:startOverride w:val="3"/>
@@ -1590,20 +1710,20 @@
       <w:startOverride w:val="1"/>
     </w:lvlOverride>
   </w:num>
-  <w:num w:numId="3">
+  <w:num w:numId="3" w16cid:durableId="1358235828">
     <w:abstractNumId w:val="0"/>
   </w:num>
-  <w:num w:numId="4">
+  <w:num w:numId="4" w16cid:durableId="436682146">
     <w:abstractNumId w:val="1"/>
   </w:num>
-  <w:num w:numId="5">
+  <w:num w:numId="5" w16cid:durableId="370962340">
     <w:abstractNumId w:val="3"/>
   </w:num>
 </w:numbering>
 </file>
 
 <file path=word/styles.xml><?xml version="1.0" encoding="utf-8"?>
-<w:styles xmlns:mc="http://schemas.openxmlformats.org/markup-compatibility/2006" xmlns:r="http://schemas.openxmlformats.org/officeDocument/2006/relationships" xmlns:w="http://schemas.openxmlformats.org/wordprocessingml/2006/main" xmlns:w14="http://schemas.microsoft.com/office/word/2010/wordml" xmlns:w15="http://schemas.microsoft.com/office/word/2012/wordml" mc:Ignorable="w14 w15">
+<w:styles xmlns:mc="http://schemas.openxmlformats.org/markup-compatibility/2006" xmlns:r="http://schemas.openxmlformats.org/officeDocument/2006/relationships" xmlns:w="http://schemas.openxmlformats.org/wordprocessingml/2006/main" xmlns:w14="http://schemas.microsoft.com/office/word/2010/wordml" xmlns:w15="http://schemas.microsoft.com/office/word/2012/wordml" xmlns:w16cex="http://schemas.microsoft.com/office/word/2018/wordml/cex" xmlns:w16cid="http://schemas.microsoft.com/office/word/2016/wordml/cid" xmlns:w16="http://schemas.microsoft.com/office/word/2018/wordml" xmlns:w16sdtdh="http://schemas.microsoft.com/office/word/2020/wordml/sdtdatahash" xmlns:w16se="http://schemas.microsoft.com/office/word/2015/wordml/symex" mc:Ignorable="w14 w15 w16se w16cid w16 w16cex w16sdtdh">
   <w:docDefaults>
     <w:rPrDefault>
       <w:rPr>
@@ -1619,7 +1739,7 @@
       </w:pPr>
     </w:pPrDefault>
   </w:docDefaults>
-  <w:latentStyles w:defLockedState="0" w:defUIPriority="99" w:defSemiHidden="0" w:defUnhideWhenUsed="0" w:defQFormat="0" w:count="371">
+  <w:latentStyles w:defLockedState="0" w:defUIPriority="99" w:defSemiHidden="0" w:defUnhideWhenUsed="0" w:defQFormat="0" w:count="376">
     <w:lsdException w:name="Normal" w:uiPriority="0" w:qFormat="1"/>
     <w:lsdException w:name="heading 1" w:uiPriority="9" w:qFormat="1"/>
     <w:lsdException w:name="heading 2" w:semiHidden="1" w:uiPriority="0" w:unhideWhenUsed="1" w:qFormat="1"/>
@@ -1991,6 +2111,11 @@
     <w:lsdException w:name="List Table 5 Dark Accent 6" w:uiPriority="50"/>
     <w:lsdException w:name="List Table 6 Colorful Accent 6" w:uiPriority="51"/>
     <w:lsdException w:name="List Table 7 Colorful Accent 6" w:uiPriority="52"/>
+    <w:lsdException w:name="Mention" w:semiHidden="1" w:unhideWhenUsed="1"/>
+    <w:lsdException w:name="Smart Hyperlink" w:semiHidden="1" w:unhideWhenUsed="1"/>
+    <w:lsdException w:name="Hashtag" w:semiHidden="1" w:unhideWhenUsed="1"/>
+    <w:lsdException w:name="Unresolved Mention" w:semiHidden="1" w:unhideWhenUsed="1"/>
+    <w:lsdException w:name="Smart Link" w:semiHidden="1" w:unhideWhenUsed="1"/>
   </w:latentStyles>
   <w:style w:type="paragraph" w:default="1" w:styleId="Normal">
     <w:name w:val="Normal"/>

</xml_diff>